<commit_message>
Version 1.1 - Updated QA document
</commit_message>
<xml_diff>
--- a/QA-Document.docx
+++ b/QA-Document.docx
@@ -44,7 +44,10 @@
         <w:t>Version:</w:t>
       </w:r>
       <w:r>
-        <w:t xml:space="preserve"> 1.0</w:t>
+        <w:t xml:space="preserve"> 1.</w:t>
+      </w:r>
+      <w:r>
+        <w:t>1</w:t>
       </w:r>
     </w:p>
     <w:p/>
@@ -137,6 +140,11 @@
     <w:p>
       <w:r>
         <w:t>4. Valid credentials should allow login.</w:t>
+      </w:r>
+    </w:p>
+    <w:p>
+      <w:r>
+        <w:t>5. Forgot Password option should be available.</w:t>
       </w:r>
     </w:p>
     <w:sectPr>
@@ -752,7 +760,6 @@
   <w:style w:type="character" w:default="1" w:styleId="DefaultParagraphFont">
     <w:name w:val="Default Paragraph Font"/>
     <w:uiPriority w:val="1"/>
-    <w:semiHidden/>
     <w:unhideWhenUsed/>
   </w:style>
   <w:style w:type="table" w:default="1" w:styleId="TableNormal">

</xml_diff>